<commit_message>
3.A.24: en la mayoría óptima de Buchanan y Tullock el mínimo de la suma ya no coincide con el corte de las 2 curvas
Co-Authored-By: Claude Opus 5.5 <noreply@anthropic.com>
Claude-Session: https://claude.ai/code/session_01GHmnmpZ4KoguEZPymyjyrT
</commit_message>
<xml_diff>
--- a/oposicion/temario/tercer-ejercicio/3A24.docx
+++ b/oposicion/temario/tercer-ejercicio/3A24.docx
@@ -27700,7 +27700,7 @@
       <w:r>
         <w:drawing>
           <wp:inline>
-            <wp:extent cx="2779898" cy="2107095"/>
+            <wp:extent cx="2841062" cy="2370100"/>
             <wp:effectExtent b="0" l="0" r="0" t="0"/>
             <wp:docPr descr="Gráfico 5.– Mayoría óptima de Buchanan y Tullock" title="" id="188" name="Picture"/>
             <a:graphic>
@@ -27721,7 +27721,7 @@
                   <pic:spPr bwMode="auto">
                     <a:xfrm>
                       <a:off x="0" y="0"/>
-                      <a:ext cx="2779898" cy="2107095"/>
+                      <a:ext cx="2841062" cy="2370100"/>
                     </a:xfrm>
                     <a:prstGeom prst="rect">
                       <a:avLst/>

</xml_diff>

<commit_message>
3.A.24: fuera el refrán «Cada maestrillo tiene su librillo» junto a Borda (tema, ficha y canon)
Co-Authored-By: Claude Opus 5.5 <noreply@anthropic.com>
Claude-Session: https://claude.ai/code/session_01GHmnmpZ4KoguEZPymyjyrT
</commit_message>
<xml_diff>
--- a/oposicion/temario/tercer-ejercicio/3A24.docx
+++ b/oposicion/temario/tercer-ejercicio/3A24.docx
@@ -20559,7 +20559,7 @@
         </w:r>
       </w:hyperlink>
       <w:r>
-        <w:t xml:space="preserve">), con «Cada maestrillo tiene su librillo» a la derecha; el intercambio de votos, de palabra, con los números de los vecinos. Se marca I.</w:t>
+        <w:t xml:space="preserve">); el intercambio de votos, de palabra, con los números de los vecinos. Se marca I.</w:t>
       </w:r>
     </w:p>
     <w:p>
@@ -25169,7 +25169,7 @@
         </w:numPr>
       </w:pPr>
       <w:r>
-        <w:t xml:space="preserve">«Cada maestrillo tiene su librillo», dice el refrán: con las mismas preferencias, la mayoría elige</w:t>
+        <w:t xml:space="preserve">Con las mismas preferencias, la mayoría elige</w:t>
       </w:r>
       <w:r>
         <w:t xml:space="preserve"> </w:t>
@@ -25206,7 +25206,7 @@
         </m:r>
       </m:oMath>
       <w:r>
-        <w:t xml:space="preserve">. El ganador depende de la regla.</w:t>
+        <w:t xml:space="preserve">: el ganador depende de la regla.</w:t>
       </w:r>
     </w:p>
     <w:p>

</xml_diff>